<commit_message>
Redesenha currículos com ícones cores e prévias visuais
</commit_message>
<xml_diff>
--- a/dist/downloads/curriculo-com-projetos.docx
+++ b/dist/downloads/curriculo-com-projetos.docx
@@ -12,25 +12,85 @@
     </w:p>
     <w:p>
       <w:r>
-        <w:t>[Cidade e UF] | [Telefone com DDD] | [E-mail profissional]</w:t>
+        <w:rPr>
+          <w:b/>
+          <w:color w:val="42556E"/>
+          <w:sz w:val="20"/>
+        </w:rPr>
+        <w:t>ESTUDANTE DE [CURSO]  |  ESTÁGIO EM [ÁREA]</w:t>
       </w:r>
     </w:p>
     <w:p>
+      <w:pPr>
+        <w:spacing w:after="60"/>
+      </w:pPr>
       <w:r>
-        <w:t>[LinkedIn, se tiver] | [GitHub ou portfólio, se tiver]</w:t>
+        <w:rPr>
+          <w:sz w:val="20"/>
+        </w:rPr>
+        <w:t>[Cidade e UF]  •  [Telefone com DDD]  •  [E-mail profissional]</w:t>
+      </w:r>
+    </w:p>
+    <w:p>
+      <w:pPr>
+        <w:spacing w:after="60"/>
+      </w:pPr>
+      <w:r>
+        <w:rPr>
+          <w:sz w:val="20"/>
+        </w:rPr>
+        <w:t>[LinkedIn, se tiver]  •  [GitHub ou portfólio, se tiver]</w:t>
       </w:r>
     </w:p>
     <w:p>
       <w:pPr>
         <w:pStyle w:val="Heading1"/>
+        <w:pBdr>
+          <w:bottom w:val="single" w:sz="6" w:space="4" w:color="202831"/>
+        </w:pBdr>
       </w:pPr>
       <w:r>
-        <w:t>Objetivo</w:t>
+        <w:drawing>
+          <wp:inline xmlns:a="http://schemas.openxmlformats.org/drawingml/2006/main" xmlns:pic="http://schemas.openxmlformats.org/drawingml/2006/picture">
+            <wp:extent cx="164592" cy="164592"/>
+            <wp:docPr id="1" name="Picture 1"/>
+            <wp:cNvGraphicFramePr>
+              <a:graphicFrameLocks noChangeAspect="1"/>
+            </wp:cNvGraphicFramePr>
+            <a:graphic>
+              <a:graphicData uri="http://schemas.openxmlformats.org/drawingml/2006/picture">
+                <pic:pic>
+                  <pic:nvPicPr>
+                    <pic:cNvPr id="0" name="goal.png"/>
+                    <pic:cNvPicPr/>
+                  </pic:nvPicPr>
+                  <pic:blipFill>
+                    <a:blip r:embed="rId10"/>
+                    <a:stretch>
+                      <a:fillRect/>
+                    </a:stretch>
+                  </pic:blipFill>
+                  <pic:spPr>
+                    <a:xfrm>
+                      <a:off x="0" y="0"/>
+                      <a:ext cx="164592" cy="164592"/>
+                    </a:xfrm>
+                    <a:prstGeom prst="rect"/>
+                  </pic:spPr>
+                </pic:pic>
+              </a:graphicData>
+            </a:graphic>
+          </wp:inline>
+        </w:drawing>
+      </w:r>
+      <w:r>
+        <w:t xml:space="preserve">  OBJETIVO</w:t>
       </w:r>
     </w:p>
     <w:p>
       <w:pPr>
         <w:widowControl/>
+        <w:ind w:left="374"/>
       </w:pPr>
       <w:r>
         <w:t>Estágio em [desenvolvimento, dados, suporte ou outra área da vaga].</w:t>
@@ -39,14 +99,52 @@
     <w:p>
       <w:pPr>
         <w:pStyle w:val="Heading1"/>
+        <w:pBdr>
+          <w:bottom w:val="single" w:sz="6" w:space="4" w:color="202831"/>
+        </w:pBdr>
       </w:pPr>
       <w:r>
-        <w:t>Resumo</w:t>
+        <w:drawing>
+          <wp:inline xmlns:a="http://schemas.openxmlformats.org/drawingml/2006/main" xmlns:pic="http://schemas.openxmlformats.org/drawingml/2006/picture">
+            <wp:extent cx="164592" cy="164592"/>
+            <wp:docPr id="2" name="Picture 2"/>
+            <wp:cNvGraphicFramePr>
+              <a:graphicFrameLocks noChangeAspect="1"/>
+            </wp:cNvGraphicFramePr>
+            <a:graphic>
+              <a:graphicData uri="http://schemas.openxmlformats.org/drawingml/2006/picture">
+                <pic:pic>
+                  <pic:nvPicPr>
+                    <pic:cNvPr id="0" name="person.png"/>
+                    <pic:cNvPicPr/>
+                  </pic:nvPicPr>
+                  <pic:blipFill>
+                    <a:blip r:embed="rId11"/>
+                    <a:stretch>
+                      <a:fillRect/>
+                    </a:stretch>
+                  </pic:blipFill>
+                  <pic:spPr>
+                    <a:xfrm>
+                      <a:off x="0" y="0"/>
+                      <a:ext cx="164592" cy="164592"/>
+                    </a:xfrm>
+                    <a:prstGeom prst="rect"/>
+                  </pic:spPr>
+                </pic:pic>
+              </a:graphicData>
+            </a:graphic>
+          </wp:inline>
+        </w:drawing>
+      </w:r>
+      <w:r>
+        <w:t xml:space="preserve">  RESUMO</w:t>
       </w:r>
     </w:p>
     <w:p>
       <w:pPr>
         <w:widowControl/>
+        <w:ind w:left="374"/>
       </w:pPr>
       <w:r>
         <w:t>Estudante de [curso], com prática em [tecnologias] em projetos [acadêmicos ou pessoais]. Interesse em [área relacionada à vaga].</w:t>
@@ -55,16 +153,58 @@
     <w:p>
       <w:pPr>
         <w:pStyle w:val="Heading1"/>
+        <w:pBdr>
+          <w:bottom w:val="single" w:sz="6" w:space="4" w:color="202831"/>
+        </w:pBdr>
       </w:pPr>
       <w:r>
-        <w:t>Projetos selecionados</w:t>
+        <w:drawing>
+          <wp:inline xmlns:a="http://schemas.openxmlformats.org/drawingml/2006/main" xmlns:pic="http://schemas.openxmlformats.org/drawingml/2006/picture">
+            <wp:extent cx="164592" cy="164592"/>
+            <wp:docPr id="3" name="Picture 3"/>
+            <wp:cNvGraphicFramePr>
+              <a:graphicFrameLocks noChangeAspect="1"/>
+            </wp:cNvGraphicFramePr>
+            <a:graphic>
+              <a:graphicData uri="http://schemas.openxmlformats.org/drawingml/2006/picture">
+                <pic:pic>
+                  <pic:nvPicPr>
+                    <pic:cNvPr id="0" name="project.png"/>
+                    <pic:cNvPicPr/>
+                  </pic:nvPicPr>
+                  <pic:blipFill>
+                    <a:blip r:embed="rId12"/>
+                    <a:stretch>
+                      <a:fillRect/>
+                    </a:stretch>
+                  </pic:blipFill>
+                  <pic:spPr>
+                    <a:xfrm>
+                      <a:off x="0" y="0"/>
+                      <a:ext cx="164592" cy="164592"/>
+                    </a:xfrm>
+                    <a:prstGeom prst="rect"/>
+                  </pic:spPr>
+                </pic:pic>
+              </a:graphicData>
+            </a:graphic>
+          </wp:inline>
+        </w:drawing>
+      </w:r>
+      <w:r>
+        <w:t xml:space="preserve">  PROJETOS SELECIONADOS</w:t>
       </w:r>
     </w:p>
     <w:p>
       <w:pPr>
         <w:widowControl/>
+        <w:ind w:left="374"/>
       </w:pPr>
       <w:r>
+        <w:rPr>
+          <w:b/>
+          <w:color w:val="18212A"/>
+        </w:rPr>
         <w:t>[Nome do projeto 1] | [período] | [link do repositório ou demonstração]</w:t>
       </w:r>
     </w:p>
@@ -89,8 +229,13 @@
     <w:p>
       <w:pPr>
         <w:widowControl/>
+        <w:ind w:left="374"/>
       </w:pPr>
       <w:r>
+        <w:rPr>
+          <w:b/>
+          <w:color w:val="18212A"/>
+        </w:rPr>
         <w:t>[Nome do projeto 2] | [período] | [link do repositório ou demonstração]</w:t>
       </w:r>
     </w:p>
@@ -106,22 +251,65 @@
     <w:p>
       <w:pPr>
         <w:pStyle w:val="Heading1"/>
+        <w:pBdr>
+          <w:bottom w:val="single" w:sz="6" w:space="4" w:color="202831"/>
+        </w:pBdr>
       </w:pPr>
       <w:r>
-        <w:t>Experiência e atividades</w:t>
+        <w:drawing>
+          <wp:inline xmlns:a="http://schemas.openxmlformats.org/drawingml/2006/main" xmlns:pic="http://schemas.openxmlformats.org/drawingml/2006/picture">
+            <wp:extent cx="164592" cy="164592"/>
+            <wp:docPr id="4" name="Picture 4"/>
+            <wp:cNvGraphicFramePr>
+              <a:graphicFrameLocks noChangeAspect="1"/>
+            </wp:cNvGraphicFramePr>
+            <a:graphic>
+              <a:graphicData uri="http://schemas.openxmlformats.org/drawingml/2006/picture">
+                <pic:pic>
+                  <pic:nvPicPr>
+                    <pic:cNvPr id="0" name="work.png"/>
+                    <pic:cNvPicPr/>
+                  </pic:nvPicPr>
+                  <pic:blipFill>
+                    <a:blip r:embed="rId13"/>
+                    <a:stretch>
+                      <a:fillRect/>
+                    </a:stretch>
+                  </pic:blipFill>
+                  <pic:spPr>
+                    <a:xfrm>
+                      <a:off x="0" y="0"/>
+                      <a:ext cx="164592" cy="164592"/>
+                    </a:xfrm>
+                    <a:prstGeom prst="rect"/>
+                  </pic:spPr>
+                </pic:pic>
+              </a:graphicData>
+            </a:graphic>
+          </wp:inline>
+        </w:drawing>
+      </w:r>
+      <w:r>
+        <w:t xml:space="preserve">  EXPERIÊNCIA E ATIVIDADES</w:t>
       </w:r>
     </w:p>
     <w:p>
       <w:pPr>
         <w:widowControl/>
+        <w:ind w:left="374"/>
       </w:pPr>
       <w:r>
+        <w:rPr>
+          <w:b/>
+          <w:color w:val="18212A"/>
+        </w:rPr>
         <w:t>[Função em emprego, monitoria, voluntariado ou extensão] — [Organização]</w:t>
       </w:r>
     </w:p>
     <w:p>
       <w:pPr>
         <w:widowControl/>
+        <w:ind w:left="374"/>
       </w:pPr>
       <w:r>
         <w:t>[Mês/ano de início] a [mês/ano de fim ou atual]</w:t>
@@ -139,30 +327,110 @@
     <w:p>
       <w:pPr>
         <w:pStyle w:val="Heading1"/>
+        <w:pBdr>
+          <w:bottom w:val="single" w:sz="6" w:space="4" w:color="202831"/>
+        </w:pBdr>
       </w:pPr>
       <w:r>
-        <w:t>Formação acadêmica</w:t>
+        <w:drawing>
+          <wp:inline xmlns:a="http://schemas.openxmlformats.org/drawingml/2006/main" xmlns:pic="http://schemas.openxmlformats.org/drawingml/2006/picture">
+            <wp:extent cx="164592" cy="164592"/>
+            <wp:docPr id="5" name="Picture 5"/>
+            <wp:cNvGraphicFramePr>
+              <a:graphicFrameLocks noChangeAspect="1"/>
+            </wp:cNvGraphicFramePr>
+            <a:graphic>
+              <a:graphicData uri="http://schemas.openxmlformats.org/drawingml/2006/picture">
+                <pic:pic>
+                  <pic:nvPicPr>
+                    <pic:cNvPr id="0" name="education.png"/>
+                    <pic:cNvPicPr/>
+                  </pic:nvPicPr>
+                  <pic:blipFill>
+                    <a:blip r:embed="rId14"/>
+                    <a:stretch>
+                      <a:fillRect/>
+                    </a:stretch>
+                  </pic:blipFill>
+                  <pic:spPr>
+                    <a:xfrm>
+                      <a:off x="0" y="0"/>
+                      <a:ext cx="164592" cy="164592"/>
+                    </a:xfrm>
+                    <a:prstGeom prst="rect"/>
+                  </pic:spPr>
+                </pic:pic>
+              </a:graphicData>
+            </a:graphic>
+          </wp:inline>
+        </w:drawing>
+      </w:r>
+      <w:r>
+        <w:t xml:space="preserve">  FORMAÇÃO ACADÊMICA</w:t>
       </w:r>
     </w:p>
     <w:p>
       <w:pPr>
         <w:widowControl/>
+        <w:ind w:left="374"/>
       </w:pPr>
       <w:r>
+        <w:rPr>
+          <w:b/>
+          <w:color w:val="18212A"/>
+        </w:rPr>
         <w:t>[Curso] — [Instituição] | [período atual] | Conclusão prevista: [mês/ano]</w:t>
       </w:r>
     </w:p>
     <w:p>
       <w:pPr>
         <w:pStyle w:val="Heading1"/>
+        <w:pBdr>
+          <w:bottom w:val="single" w:sz="6" w:space="4" w:color="202831"/>
+        </w:pBdr>
       </w:pPr>
       <w:r>
-        <w:t>Conhecimentos e cursos</w:t>
+        <w:drawing>
+          <wp:inline xmlns:a="http://schemas.openxmlformats.org/drawingml/2006/main" xmlns:pic="http://schemas.openxmlformats.org/drawingml/2006/picture">
+            <wp:extent cx="164592" cy="164592"/>
+            <wp:docPr id="6" name="Picture 6"/>
+            <wp:cNvGraphicFramePr>
+              <a:graphicFrameLocks noChangeAspect="1"/>
+            </wp:cNvGraphicFramePr>
+            <a:graphic>
+              <a:graphicData uri="http://schemas.openxmlformats.org/drawingml/2006/picture">
+                <pic:pic>
+                  <pic:nvPicPr>
+                    <pic:cNvPr id="0" name="code.png"/>
+                    <pic:cNvPicPr/>
+                  </pic:nvPicPr>
+                  <pic:blipFill>
+                    <a:blip r:embed="rId15"/>
+                    <a:stretch>
+                      <a:fillRect/>
+                    </a:stretch>
+                  </pic:blipFill>
+                  <pic:spPr>
+                    <a:xfrm>
+                      <a:off x="0" y="0"/>
+                      <a:ext cx="164592" cy="164592"/>
+                    </a:xfrm>
+                    <a:prstGeom prst="rect"/>
+                  </pic:spPr>
+                </pic:pic>
+              </a:graphicData>
+            </a:graphic>
+          </wp:inline>
+        </w:drawing>
+      </w:r>
+      <w:r>
+        <w:t xml:space="preserve">  CONHECIMENTOS E CURSOS</w:t>
       </w:r>
     </w:p>
     <w:p>
       <w:pPr>
         <w:widowControl/>
+        <w:ind w:left="374"/>
       </w:pPr>
       <w:r>
         <w:t>[Linguagens, ferramentas e práticas utilizadas nos projetos]</w:t>
@@ -171,6 +439,7 @@
     <w:p>
       <w:pPr>
         <w:widowControl/>
+        <w:ind w:left="374"/>
       </w:pPr>
       <w:r>
         <w:t>[Curso relevante] — [Instituição] | [ano]</w:t>
@@ -179,27 +448,118 @@
     <w:p>
       <w:pPr>
         <w:pStyle w:val="Heading1"/>
+        <w:pBdr>
+          <w:bottom w:val="single" w:sz="6" w:space="4" w:color="202831"/>
+        </w:pBdr>
       </w:pPr>
       <w:r>
-        <w:t>Idiomas e disponibilidade</w:t>
+        <w:drawing>
+          <wp:inline xmlns:a="http://schemas.openxmlformats.org/drawingml/2006/main" xmlns:pic="http://schemas.openxmlformats.org/drawingml/2006/picture">
+            <wp:extent cx="164592" cy="164592"/>
+            <wp:docPr id="7" name="Picture 7"/>
+            <wp:cNvGraphicFramePr>
+              <a:graphicFrameLocks noChangeAspect="1"/>
+            </wp:cNvGraphicFramePr>
+            <a:graphic>
+              <a:graphicData uri="http://schemas.openxmlformats.org/drawingml/2006/picture">
+                <pic:pic>
+                  <pic:nvPicPr>
+                    <pic:cNvPr id="0" name="language.png"/>
+                    <pic:cNvPicPr/>
+                  </pic:nvPicPr>
+                  <pic:blipFill>
+                    <a:blip r:embed="rId16"/>
+                    <a:stretch>
+                      <a:fillRect/>
+                    </a:stretch>
+                  </pic:blipFill>
+                  <pic:spPr>
+                    <a:xfrm>
+                      <a:off x="0" y="0"/>
+                      <a:ext cx="164592" cy="164592"/>
+                    </a:xfrm>
+                    <a:prstGeom prst="rect"/>
+                  </pic:spPr>
+                </pic:pic>
+              </a:graphicData>
+            </a:graphic>
+          </wp:inline>
+        </w:drawing>
+      </w:r>
+      <w:r>
+        <w:t xml:space="preserve">  IDIOMAS E DISPONIBILIDADE</w:t>
       </w:r>
     </w:p>
     <w:p>
       <w:pPr>
         <w:widowControl/>
+        <w:ind w:left="374"/>
       </w:pPr>
       <w:r>
         <w:t>[Idioma e nível] | [Dias e horários disponíveis] | [Modelo de trabalho]</w:t>
       </w:r>
     </w:p>
     <w:sectPr>
+      <w:headerReference w:type="default" r:id="rId9"/>
       <w:pgSz w:w="12240" w:h="15840"/>
-      <w:pgMar w:top="936" w:right="1080" w:bottom="936" w:left="1080" w:header="720" w:footer="720" w:gutter="0"/>
+      <w:pgMar w:top="835" w:right="864" w:bottom="864" w:left="864" w:header="720" w:footer="720" w:gutter="0"/>
       <w:cols w:space="720"/>
       <w:docGrid w:linePitch="360"/>
     </w:sectPr>
   </w:body>
 </w:document>
+</file>
+
+<file path=word/header1.xml><?xml version="1.0" encoding="utf-8"?>
+<w:hdr xmlns:m="http://schemas.openxmlformats.org/officeDocument/2006/math" xmlns:mc="http://schemas.openxmlformats.org/markup-compatibility/2006" xmlns:mo="http://schemas.microsoft.com/office/mac/office/2008/main" xmlns:mv="urn:schemas-microsoft-com:mac:vml" xmlns:o="urn:schemas-microsoft-com:office:office" xmlns:r="http://schemas.openxmlformats.org/officeDocument/2006/relationships" xmlns:v="urn:schemas-microsoft-com:vml" xmlns:w10="urn:schemas-microsoft-com:office:word" xmlns:w14="http://schemas.microsoft.com/office/word/2010/wordml" xmlns:w="http://schemas.openxmlformats.org/wordprocessingml/2006/main" xmlns:wne="http://schemas.microsoft.com/office/word/2006/wordml" xmlns:wp14="http://schemas.microsoft.com/office/word/2010/wordprocessingDrawing" xmlns:wp="http://schemas.openxmlformats.org/drawingml/2006/wordprocessingDrawing" xmlns:wpc="http://schemas.microsoft.com/office/word/2010/wordprocessingCanvas" xmlns:wpg="http://schemas.microsoft.com/office/word/2010/wordprocessingGroup" xmlns:wpi="http://schemas.microsoft.com/office/word/2010/wordprocessingInk" xmlns:wps="http://schemas.microsoft.com/office/word/2010/wordprocessingShape" mc:Ignorable="w14 wp14">
+  <w:p>
+    <w:pPr>
+      <w:pStyle w:val="Header"/>
+    </w:pPr>
+    <w:r>
+      <w:drawing>
+        <wp:anchor distT="0" distB="0" distL="0" distR="0" simplePos="0" relativeHeight="0" behindDoc="1" locked="0" layoutInCell="1" allowOverlap="1">
+          <wp:simplePos x="0" y="0"/>
+          <wp:positionH relativeFrom="page">
+            <wp:posOffset>0</wp:posOffset>
+          </wp:positionH>
+          <wp:positionV relativeFrom="page">
+            <wp:posOffset>0</wp:posOffset>
+          </wp:positionV>
+          <wp:extent cx="7772400" cy="10058400"/>
+          <wp:wrapNone/>
+          <wp:docPr id="1" name="Picture 1"/>
+          <wp:cNvGraphicFramePr xmlns:a="http://schemas.openxmlformats.org/drawingml/2006/main">
+            <a:graphicFrameLocks noChangeAspect="1"/>
+          </wp:cNvGraphicFramePr>
+          <a:graphic xmlns:a="http://schemas.openxmlformats.org/drawingml/2006/main" xmlns:pic="http://schemas.openxmlformats.org/drawingml/2006/picture">
+            <a:graphicData uri="http://schemas.openxmlformats.org/drawingml/2006/picture">
+              <pic:pic>
+                <pic:nvPicPr>
+                  <pic:cNvPr id="0" name="curriculo-com-projetos-background.png"/>
+                  <pic:cNvPicPr/>
+                </pic:nvPicPr>
+                <pic:blipFill>
+                  <a:blip r:embed="rId1"/>
+                  <a:stretch>
+                    <a:fillRect/>
+                  </a:stretch>
+                </pic:blipFill>
+                <pic:spPr>
+                  <a:xfrm>
+                    <a:off x="0" y="0"/>
+                    <a:ext cx="7772400" cy="10058400"/>
+                  </a:xfrm>
+                  <a:prstGeom prst="rect"/>
+                </pic:spPr>
+              </pic:pic>
+            </a:graphicData>
+          </a:graphic>
+        </wp:anchor>
+      </w:drawing>
+    </w:r>
+  </w:p>
+</w:hdr>
 </file>
 
 <file path=word/numbering.xml><?xml version="1.0" encoding="utf-8"?>
@@ -566,11 +926,11 @@
     <w:qFormat/>
     <w:rsid w:val="00FC693F"/>
     <w:pPr>
-      <w:spacing w:after="100" w:line="252" w:lineRule="auto"/>
+      <w:spacing w:after="80" w:line="252" w:lineRule="auto"/>
     </w:pPr>
     <w:rPr>
       <w:rFonts w:ascii="Calibri" w:hAnsi="Calibri"/>
-      <w:color w:val="000000"/>
+      <w:color w:val="333B43"/>
       <w:sz w:val="22"/>
       <w:lang w:val="pt-BR"/>
     </w:rPr>
@@ -636,7 +996,7 @@
     <w:pPr>
       <w:keepNext/>
       <w:keepLines/>
-      <w:spacing w:before="240" w:after="100" w:line="252" w:lineRule="auto"/>
+      <w:spacing w:before="260" w:after="140" w:line="252" w:lineRule="auto"/>
       <w:outlineLvl w:val="0"/>
     </w:pPr>
     <w:rPr>
@@ -661,14 +1021,14 @@
     <w:pPr>
       <w:keepNext/>
       <w:keepLines/>
-      <w:spacing w:before="200" w:after="100" w:line="252" w:lineRule="auto"/>
+      <w:spacing w:before="200" w:after="80" w:line="252" w:lineRule="auto"/>
       <w:outlineLvl w:val="1"/>
     </w:pPr>
     <w:rPr>
       <w:rFonts w:asciiTheme="majorHAnsi" w:eastAsiaTheme="majorEastAsia" w:hAnsiTheme="majorHAnsi" w:cstheme="majorBidi" w:ascii="Calibri" w:hAnsi="Calibri"/>
       <w:b/>
       <w:bCs/>
-      <w:color w:val="000000"/>
+      <w:color w:val="333B43"/>
       <w:sz w:val="22"/>
       <w:szCs w:val="26"/>
       <w:lang w:val="pt-BR"/>
@@ -943,7 +1303,7 @@
       <w:color w:val="000000"/>
       <w:spacing w:val="5"/>
       <w:kern w:val="28"/>
-      <w:sz w:val="44"/>
+      <w:sz w:val="60"/>
       <w:szCs w:val="52"/>
       <w:lang w:val="pt-BR"/>
     </w:rPr>
@@ -975,13 +1335,13 @@
       <w:numPr>
         <w:ilvl w:val="1"/>
       </w:numPr>
-      <w:spacing w:after="100" w:line="252" w:lineRule="auto"/>
+      <w:spacing w:after="80" w:line="252" w:lineRule="auto"/>
     </w:pPr>
     <w:rPr>
       <w:rFonts w:asciiTheme="majorHAnsi" w:eastAsiaTheme="majorEastAsia" w:hAnsiTheme="majorHAnsi" w:cstheme="majorBidi" w:ascii="Calibri" w:hAnsi="Calibri"/>
       <w:i/>
       <w:iCs/>
-      <w:color w:val="000000"/>
+      <w:color w:val="333B43"/>
       <w:spacing w:val="15"/>
       <w:sz w:val="22"/>
       <w:szCs w:val="24"/>
@@ -1139,12 +1499,12 @@
       <w:numPr>
         <w:numId w:val="1"/>
       </w:numPr>
-      <w:spacing w:after="100" w:line="252" w:lineRule="auto"/>
+      <w:spacing w:after="80" w:line="252" w:lineRule="auto"/>
       <w:contextualSpacing/>
     </w:pPr>
     <w:rPr>
       <w:rFonts w:ascii="Calibri" w:hAnsi="Calibri"/>
-      <w:color w:val="000000"/>
+      <w:color w:val="333B43"/>
       <w:sz w:val="22"/>
       <w:lang w:val="pt-BR"/>
     </w:rPr>

</xml_diff>